<commit_message>
Normaliza estilos de plantilla Word académica
</commit_message>
<xml_diff>
--- a/doc/t.docx
+++ b/doc/t.docx
@@ -8,6 +8,7 @@
       </w:pPr>
       <w:bookmarkStart w:id="0" w:name="Xf94e9663d8d18ae480f7c4b30ba242d79be2b88"/>
       <w:r>
+        <w:rPr/>
         <w:t>Guía de Análisis: La Medición de la Dependencia</w:t>
       </w:r>
     </w:p>
@@ -17,6 +18,7 @@
       </w:pPr>
       <w:bookmarkStart w:id="1" w:name="X5b8cc8388550e5f8af552121fd70815bb84f836"/>
       <w:r>
+        <w:rPr/>
         <w:t>Maestría en Intervención Social Gerontológica</w:t>
       </w:r>
     </w:p>
@@ -27,6 +29,7 @@
       <w:bookmarkStart w:id="2" w:name="X2200e31ad024980c5f1fecf04d2f9100bbc8412"/>
       <w:bookmarkEnd w:id="1"/>
       <w:r>
+        <w:rPr/>
         <w:t>Docente: Dr. Jorge Enrique Bracamontes Grajeda</w:t>
       </w:r>
     </w:p>
@@ -37,6 +40,7 @@
       <w:bookmarkStart w:id="3" w:name="X019c8a89ed9416c14741e63700c503390df02ba"/>
       <w:bookmarkEnd w:id="2"/>
       <w:r>
+        <w:rPr/>
         <w:t>Pareja 1: Los Administradores de la Carencia (Autonomía vs. Dependencia)</w:t>
       </w:r>
     </w:p>
@@ -47,6 +51,7 @@
       <w:bookmarkStart w:id="4" w:name="Xe8244624ce2a710b9267c1efa7c90684023549e"/>
       <w:bookmarkEnd w:id="3"/>
       <w:r>
+        <w:rPr/>
         <w:t>Insumos de trabajo: * ENASEM 2024 (Págs. 22-24: Limitación de actividades de la vida diaria).</w:t>
       </w:r>
     </w:p>
@@ -59,6 +64,7 @@
         </w:numPr>
       </w:pPr>
       <w:r>
+        <w:rPr/>
         <w:t>Informe Beveridge (Concepto de infortunio y necesidad).</w:t>
       </w:r>
     </w:p>
@@ -67,6 +73,7 @@
         <w:pStyle w:val="FirstParagraph"/>
       </w:pPr>
       <w:r>
+        <w:rPr/>
         <w:t>Instrucciones de Laboratorio:</w:t>
       </w:r>
     </w:p>
@@ -86,6 +93,7 @@
         <w:t>Mapeo de la ‘No-Capacidad’:</w:t>
       </w:r>
       <w:r>
+        <w:rPr/>
         <w:t xml:space="preserve"> Analicen las gráficas de limitaciones para realizar actividades básicas (comer, vestirse, caminar). ¿Por qué la estadística prefiere medir lo que el cuerpo </w:t>
       </w:r>
       <w:r>
@@ -96,6 +104,7 @@
         <w:t>ya no hace</w:t>
       </w:r>
       <w:r>
+        <w:rPr/>
         <w:t xml:space="preserve"> en lugar de lo que </w:t>
       </w:r>
       <w:r>
@@ -106,6 +115,7 @@
         <w:t>aún preserva</w:t>
       </w:r>
       <w:r>
+        <w:rPr/>
         <w:t>?</w:t>
       </w:r>
     </w:p>
@@ -125,6 +135,7 @@
         <w:t>El Umbral de Beveridge:</w:t>
       </w:r>
       <w:r>
+        <w:rPr/>
         <w:t xml:space="preserve"> Si el sistema de bienestar solo se activa cuando el sujeto marca “Sí” en estas limitaciones, ¿qué tipo de ciudadano está construyendo la administración?</w:t>
       </w:r>
     </w:p>
@@ -144,6 +155,7 @@
         <w:t>Deconstrucción:</w:t>
       </w:r>
       <w:r>
+        <w:rPr/>
         <w:t xml:space="preserve"> Elijan una variable de “limitación” y renómbrela desde la </w:t>
       </w:r>
       <w:r>
@@ -154,6 +166,7 @@
         <w:t>Potentia</w:t>
       </w:r>
       <w:r>
+        <w:rPr/>
         <w:t>. ¿Cómo se vería un indicador que mida la “Dignidad en la Autonomía” en lugar de la “Carga de la Dependencia”?</w:t>
       </w:r>
     </w:p>
@@ -172,6 +185,7 @@
       <w:bookmarkEnd w:id="0"/>
       <w:bookmarkEnd w:id="4"/>
       <w:r>
+        <w:rPr/>
         <w:br w:type="page"/>
       </w:r>
     </w:p>
@@ -180,6 +194,7 @@
         <w:pStyle w:val="Ttulo1"/>
       </w:pPr>
       <w:r>
+        <w:rPr/>
         <w:lastRenderedPageBreak/>
         <w:t>Guía de Análisis: La Biopolítica del Diagnóstico</w:t>
       </w:r>
@@ -190,6 +205,7 @@
       </w:pPr>
       <w:bookmarkStart w:id="6" w:name="X08f92f6eaf85a31b036e50dbe77c8184374fb18"/>
       <w:r>
+        <w:rPr/>
         <w:t>Maestría en Intervención Social Gerontológica</w:t>
       </w:r>
     </w:p>
@@ -200,6 +216,7 @@
       <w:bookmarkStart w:id="7" w:name="X1c4b1af008e584960ef394f20d788656b73ccb6"/>
       <w:bookmarkEnd w:id="6"/>
       <w:r>
+        <w:rPr/>
         <w:t>Docente: Dr. Jorge Enrique Bracamontes Grajeda</w:t>
       </w:r>
     </w:p>
@@ -210,6 +227,7 @@
       <w:bookmarkStart w:id="8" w:name="Xf0de70fecde515f76c43eea5ce44638125bb8ff"/>
       <w:bookmarkEnd w:id="7"/>
       <w:r>
+        <w:rPr/>
         <w:t>Pareja 2: Los Gestores del Riesgo Sanitario (Cuerpo vs. Diagnóstico)</w:t>
       </w:r>
     </w:p>
@@ -220,6 +238,7 @@
       <w:bookmarkStart w:id="9" w:name="Xfc80c5a33e0b3aa88616e586646f04c3c4c4410"/>
       <w:bookmarkEnd w:id="8"/>
       <w:r>
+        <w:rPr/>
         <w:t>Insumos de trabajo: * ENASEM 2024 (Págs. 13-18: Diagnóstico de enfermedades).</w:t>
       </w:r>
     </w:p>
@@ -232,6 +251,7 @@
         </w:numPr>
       </w:pPr>
       <w:r>
+        <w:rPr/>
         <w:t>Informe Beveridge (La enfermedad como riesgo administrable).</w:t>
       </w:r>
     </w:p>
@@ -242,6 +262,7 @@
       <w:bookmarkStart w:id="10" w:name="instrucciones-de-laboratorio"/>
       <w:bookmarkEnd w:id="9"/>
       <w:r>
+        <w:rPr/>
         <w:t>Instrucciones de Laboratorio:</w:t>
       </w:r>
     </w:p>
@@ -261,6 +282,7 @@
         <w:t>La Identidad Médica:</w:t>
       </w:r>
       <w:r>
+        <w:rPr/>
         <w:t xml:space="preserve"> Observen la prevalencia de enfermedades crónicas. ¿De qué manera el diagnóstico médico se convierte en la única “identidad oficial” del adulto mayor ante el Estado?</w:t>
       </w:r>
     </w:p>
@@ -280,6 +302,7 @@
         <w:t>Invisibilidad:</w:t>
       </w:r>
       <w:r>
+        <w:rPr/>
         <w:t xml:space="preserve"> Si un adulto mayor en Durango tiene una alta Potentia (vitalidad, deseo, proyectos) pero no tiene un diagnóstico clínico, ¿aparece en estas gráficas? ¿El sistema sabe que existe?</w:t>
       </w:r>
     </w:p>
@@ -299,6 +322,7 @@
         <w:t>Ejercicio Crítico:</w:t>
       </w:r>
       <w:r>
+        <w:rPr/>
         <w:t xml:space="preserve"> Contrasten la pág. 13 con la pág. 27 (Satisfacción con la vida). Si la enfermedad sube, pero la satisfacción también, ¿por qué la </w:t>
       </w:r>
       <w:r>
@@ -309,6 +333,7 @@
         <w:t>Potestas</w:t>
       </w:r>
       <w:r>
+        <w:rPr/>
         <w:t xml:space="preserve"> insiste en enfocarse solo en la patología?</w:t>
       </w:r>
     </w:p>
@@ -327,6 +352,7 @@
       <w:bookmarkEnd w:id="5"/>
       <w:bookmarkEnd w:id="10"/>
       <w:r>
+        <w:rPr/>
         <w:br w:type="page"/>
       </w:r>
     </w:p>
@@ -335,6 +361,7 @@
         <w:pStyle w:val="Ttulo1"/>
       </w:pPr>
       <w:r>
+        <w:rPr/>
         <w:lastRenderedPageBreak/>
         <w:t>Guía de Análisis: La Estructura de la Desigualdad Acumulada</w:t>
       </w:r>
@@ -345,6 +372,7 @@
       </w:pPr>
       <w:bookmarkStart w:id="12" w:name="X581265c226c0327e378380d2296ef5cb88f9096"/>
       <w:r>
+        <w:rPr/>
         <w:t>Maestría en Intervención Social Gerontológica</w:t>
       </w:r>
     </w:p>
@@ -353,6 +381,7 @@
         <w:pStyle w:val="FirstParagraph"/>
       </w:pPr>
       <w:r>
+        <w:rPr/>
         <w:t>Docente: Dr. Jorge Enrique Bracamontes Grajeda ## Pareja 3: Los Críticos de la Estructura (Desigualdad vs. Estadística)</w:t>
       </w:r>
     </w:p>
@@ -363,6 +392,7 @@
       <w:bookmarkStart w:id="13" w:name="X813bd466cfb2ebb6dcc112464f9094e4a3377d7"/>
       <w:bookmarkEnd w:id="12"/>
       <w:r>
+        <w:rPr/>
         <w:t>Insumos de trabajo: * ENASEM 2024 (Págs. 4-9: Características sociodemográficas).</w:t>
       </w:r>
     </w:p>
@@ -375,6 +405,7 @@
         </w:numPr>
       </w:pPr>
       <w:r>
+        <w:rPr/>
         <w:t>Del Popolo (Cap. III y IV: Desigualdad y vulnerabilidad en AL).</w:t>
       </w:r>
     </w:p>
@@ -385,6 +416,7 @@
       <w:bookmarkStart w:id="14" w:name="instrucciones-de-laboratorio-1"/>
       <w:bookmarkEnd w:id="13"/>
       <w:r>
+        <w:rPr/>
         <w:t>Instrucciones de Laboratorio:</w:t>
       </w:r>
     </w:p>
@@ -404,6 +436,7 @@
         <w:t>El Dato Huérfano:</w:t>
       </w:r>
       <w:r>
+        <w:rPr/>
         <w:t xml:space="preserve"> El INEGI muestra “fotografías” de la situación actual. Usando a Del Popolo, expliquen qué procesos históricos de desigualdad (educación, empleo, género) están ocultos detrás de las cifras de escolaridad y seguridad social del reporte 2024.</w:t>
       </w:r>
     </w:p>
@@ -423,6 +456,7 @@
         <w:t>Canibalismo Social:</w:t>
       </w:r>
       <w:r>
+        <w:rPr/>
         <w:t xml:space="preserve"> Analicen los datos de “Ayuda informal”. ¿Cómo se refleja en estas tablas el hecho de que el sistema económico extrae valor del cuidado que los viejos dan a otros sin pagarlo?</w:t>
       </w:r>
     </w:p>
@@ -442,6 +476,7 @@
         <w:t>Propuesta:</w:t>
       </w:r>
       <w:r>
+        <w:rPr/>
         <w:t xml:space="preserve"> Identifiquen un dato en el reporte de resultados que Del Popolo consideraría un “indicador de vulnerabilidad estructural” y propongan cómo intervenir sobre la estructura y no solo sobre el individuo.</w:t>
       </w:r>
       <w:bookmarkEnd w:id="11"/>
@@ -449,7 +484,7 @@
     </w:p>
     <w:sectPr>
       <w:pgSz w:w="12240" w:h="15840"/>
-      <w:pgMar w:top="1417" w:right="1701" w:bottom="1417" w:left="1701" w:header="720" w:footer="720" w:gutter="0"/>
+      <w:pgMar w:top="1440" w:right="1440" w:bottom="1440" w:left="1440" w:header="720" w:footer="720" w:gutter="0"/>
       <w:cols w:space="720"/>
       <w:docGrid w:linePitch="326"/>
     </w:sectPr>
@@ -1142,6 +1177,16 @@
   <w:style w:type="paragraph" w:default="1" w:styleId="Normal">
     <w:name w:val="Normal"/>
     <w:qFormat/>
+    <w:pPr>
+      <w:spacing w:before="0" w:after="0" w:line="480" w:lineRule="auto"/>
+      <w:ind w:firstLine="720"/>
+      <w:jc w:val="both"/>
+    </w:pPr>
+    <w:rPr>
+      <w:rFonts w:ascii="Arial" w:hAnsi="Arial" w:eastAsia="Arial" w:cs="Arial"/>
+      <w:color w:val="000000"/>
+      <w:sz w:val="24"/>
+    </w:rPr>
   </w:style>
   <w:style w:type="paragraph" w:styleId="Ttulo1">
     <w:name w:val="heading 1"/>
@@ -1152,15 +1197,17 @@
     <w:pPr>
       <w:keepNext/>
       <w:keepLines/>
-      <w:spacing w:before="480" w:after="0"/>
+      <w:spacing w:before="360" w:after="120" w:line="480" w:lineRule="auto"/>
+      <w:jc w:val="center"/>
       <w:outlineLvl w:val="0"/>
     </w:pPr>
     <w:rPr>
-      <w:rFonts w:asciiTheme="majorHAnsi" w:eastAsiaTheme="majorEastAsia" w:hAnsiTheme="majorHAnsi" w:cstheme="majorBidi"/>
+      <w:rFonts w:asciiTheme="majorHAnsi" w:eastAsiaTheme="majorEastAsia" w:hAnsiTheme="majorHAnsi" w:cstheme="majorBidi" w:ascii="Arial" w:hAnsi="Arial" w:eastAsia="Arial" w:cs="Arial"/>
       <w:b/>
       <w:bCs/>
-      <w:color w:val="4F81BD" w:themeColor="accent1"/>
-      <w:sz w:val="32"/>
+      <w:i w:val="0"/>
+      <w:color w:val="000000"/>
+      <w:sz w:val="28"/>
       <w:szCs w:val="32"/>
     </w:rPr>
   </w:style>
@@ -1176,14 +1223,17 @@
     <w:pPr>
       <w:keepNext/>
       <w:keepLines/>
-      <w:spacing w:before="200" w:after="0"/>
+      <w:spacing w:before="240" w:after="0" w:line="480" w:lineRule="auto"/>
+      <w:jc w:val="left"/>
       <w:outlineLvl w:val="1"/>
     </w:pPr>
     <w:rPr>
-      <w:rFonts w:ascii="Arial" w:eastAsiaTheme="majorEastAsia" w:hAnsi="Arial" w:cs="Arial"/>
+      <w:rFonts w:ascii="Arial" w:eastAsiaTheme="majorEastAsia" w:hAnsi="Arial" w:cs="Arial" w:eastAsia="Arial"/>
       <w:b/>
       <w:bCs/>
-      <w:sz w:val="28"/>
+      <w:i w:val="0"/>
+      <w:color w:val="000000"/>
+      <w:sz w:val="24"/>
       <w:szCs w:val="28"/>
     </w:rPr>
   </w:style>
@@ -1198,14 +1248,17 @@
     <w:pPr>
       <w:keepNext/>
       <w:keepLines/>
-      <w:spacing w:before="200" w:after="0" w:line="276" w:lineRule="auto"/>
-      <w:jc w:val="center"/>
+      <w:spacing w:before="240" w:after="0" w:line="480" w:lineRule="auto"/>
+      <w:jc w:val="left"/>
       <w:outlineLvl w:val="2"/>
     </w:pPr>
     <w:rPr>
-      <w:rFonts w:ascii="Arial" w:eastAsiaTheme="majorEastAsia" w:hAnsi="Arial" w:cs="Arial"/>
+      <w:rFonts w:ascii="Arial" w:eastAsiaTheme="majorEastAsia" w:hAnsi="Arial" w:cs="Arial" w:eastAsia="Arial"/>
       <w:b/>
       <w:bCs/>
+      <w:i/>
+      <w:color w:val="000000"/>
+      <w:sz w:val="24"/>
     </w:rPr>
   </w:style>
   <w:style w:type="paragraph" w:styleId="Ttulo4">
@@ -1219,14 +1272,17 @@
     <w:pPr>
       <w:keepNext/>
       <w:keepLines/>
-      <w:spacing w:before="200" w:after="0"/>
+      <w:spacing w:before="240" w:after="0" w:line="480" w:lineRule="auto"/>
+      <w:jc w:val="left"/>
       <w:outlineLvl w:val="3"/>
     </w:pPr>
     <w:rPr>
-      <w:rFonts w:ascii="Arial" w:eastAsiaTheme="majorEastAsia" w:hAnsi="Arial" w:cs="Arial"/>
+      <w:rFonts w:ascii="Arial" w:eastAsiaTheme="majorEastAsia" w:hAnsi="Arial" w:cs="Arial" w:eastAsia="Arial"/>
       <w:b/>
       <w:bCs/>
-      <w:i/>
+      <w:i w:val="0"/>
+      <w:color w:val="000000"/>
+      <w:sz w:val="24"/>
     </w:rPr>
   </w:style>
   <w:style w:type="paragraph" w:styleId="Ttulo5">
@@ -1239,13 +1295,17 @@
     <w:pPr>
       <w:keepNext/>
       <w:keepLines/>
-      <w:spacing w:before="200" w:after="0"/>
+      <w:spacing w:before="240" w:after="0" w:line="480" w:lineRule="auto"/>
+      <w:jc w:val="left"/>
       <w:outlineLvl w:val="4"/>
     </w:pPr>
     <w:rPr>
-      <w:rFonts w:asciiTheme="majorHAnsi" w:eastAsiaTheme="majorEastAsia" w:hAnsiTheme="majorHAnsi" w:cstheme="majorBidi"/>
+      <w:rFonts w:asciiTheme="majorHAnsi" w:eastAsiaTheme="majorEastAsia" w:hAnsiTheme="majorHAnsi" w:cstheme="majorBidi" w:ascii="Arial" w:hAnsi="Arial" w:eastAsia="Arial" w:cs="Arial"/>
+      <w:b w:val="0"/>
+      <w:i/>
       <w:iCs/>
-      <w:color w:val="4F81BD" w:themeColor="accent1"/>
+      <w:color w:val="000000"/>
+      <w:sz w:val="24"/>
     </w:rPr>
   </w:style>
   <w:style w:type="paragraph" w:styleId="Ttulo6">
@@ -1353,11 +1413,14 @@
     <w:qFormat/>
     <w:rsid w:val="0025433C"/>
     <w:pPr>
-      <w:spacing w:before="180" w:after="180" w:line="276" w:lineRule="auto"/>
+      <w:spacing w:before="0" w:after="0" w:line="480" w:lineRule="auto"/>
+      <w:ind w:firstLine="720"/>
       <w:jc w:val="both"/>
     </w:pPr>
     <w:rPr>
-      <w:rFonts w:ascii="Arial" w:hAnsi="Arial" w:cs="Arial"/>
+      <w:rFonts w:ascii="Arial" w:hAnsi="Arial" w:cs="Arial" w:eastAsia="Arial"/>
+      <w:color w:val="000000"/>
+      <w:sz w:val="24"/>
     </w:rPr>
   </w:style>
   <w:style w:type="paragraph" w:customStyle="1" w:styleId="FirstParagraph">
@@ -1366,9 +1429,15 @@
     <w:next w:val="Textoindependiente"/>
     <w:qFormat/>
     <w:rsid w:val="0025433C"/>
-    <w:rPr>
-      <w:b/>
+    <w:pPr>
+      <w:spacing w:before="0" w:after="0" w:line="480" w:lineRule="auto"/>
+      <w:jc w:val="both"/>
+    </w:pPr>
+    <w:rPr>
+      <w:rFonts w:ascii="Arial" w:hAnsi="Arial" w:eastAsia="Arial" w:cs="Arial"/>
       <w:bCs/>
+      <w:color w:val="000000"/>
+      <w:sz w:val="24"/>
     </w:rPr>
   </w:style>
   <w:style w:type="paragraph" w:customStyle="1" w:styleId="Compact">
@@ -1376,8 +1445,14 @@
     <w:basedOn w:val="Textoindependiente"/>
     <w:qFormat/>
     <w:pPr>
-      <w:spacing w:before="36" w:after="36"/>
-    </w:pPr>
+      <w:spacing w:before="0" w:after="0" w:line="276" w:lineRule="auto"/>
+      <w:jc w:val="both"/>
+    </w:pPr>
+    <w:rPr>
+      <w:rFonts w:ascii="Arial" w:hAnsi="Arial" w:eastAsia="Arial" w:cs="Arial"/>
+      <w:color w:val="000000"/>
+      <w:sz w:val="24"/>
+    </w:rPr>
   </w:style>
   <w:style w:type="paragraph" w:styleId="Ttulo">
     <w:name w:val="Title"/>
@@ -1388,14 +1463,16 @@
     <w:pPr>
       <w:keepNext/>
       <w:keepLines/>
-      <w:spacing w:before="480" w:after="240"/>
+      <w:spacing w:before="0" w:after="240" w:line="480" w:lineRule="auto"/>
       <w:jc w:val="center"/>
     </w:pPr>
     <w:rPr>
-      <w:rFonts w:ascii="Arial" w:eastAsiaTheme="majorEastAsia" w:hAnsi="Arial" w:cs="Arial"/>
+      <w:rFonts w:ascii="Arial" w:eastAsiaTheme="majorEastAsia" w:hAnsi="Arial" w:cs="Arial" w:eastAsia="Arial"/>
       <w:b/>
       <w:bCs/>
-      <w:sz w:val="36"/>
+      <w:i w:val="0"/>
+      <w:color w:val="000000"/>
+      <w:sz w:val="32"/>
       <w:szCs w:val="36"/>
     </w:rPr>
   </w:style>
@@ -1405,10 +1482,15 @@
     <w:next w:val="Textoindependiente"/>
     <w:qFormat/>
     <w:pPr>
-      <w:spacing w:before="240"/>
-    </w:pPr>
-    <w:rPr>
-      <w:sz w:val="30"/>
+      <w:spacing w:before="0" w:after="240" w:line="480" w:lineRule="auto"/>
+      <w:jc w:val="center"/>
+    </w:pPr>
+    <w:rPr>
+      <w:rFonts w:ascii="Arial" w:hAnsi="Arial" w:eastAsia="Arial" w:cs="Arial"/>
+      <w:b w:val="0"/>
+      <w:i w:val="0"/>
+      <w:color w:val="000000"/>
+      <w:sz w:val="24"/>
       <w:szCs w:val="30"/>
     </w:rPr>
   </w:style>
@@ -1419,8 +1501,16 @@
     <w:pPr>
       <w:keepNext/>
       <w:keepLines/>
+      <w:spacing w:before="0" w:after="0" w:line="480" w:lineRule="auto"/>
       <w:jc w:val="center"/>
     </w:pPr>
+    <w:rPr>
+      <w:rFonts w:ascii="Arial" w:hAnsi="Arial" w:eastAsia="Arial" w:cs="Arial"/>
+      <w:b w:val="0"/>
+      <w:i w:val="0"/>
+      <w:color w:val="000000"/>
+      <w:sz w:val="24"/>
+    </w:rPr>
   </w:style>
   <w:style w:type="paragraph" w:styleId="Fecha">
     <w:name w:val="Date"/>
@@ -1429,8 +1519,16 @@
     <w:pPr>
       <w:keepNext/>
       <w:keepLines/>
+      <w:spacing w:before="0" w:after="240" w:line="480" w:lineRule="auto"/>
       <w:jc w:val="center"/>
     </w:pPr>
+    <w:rPr>
+      <w:rFonts w:ascii="Arial" w:hAnsi="Arial" w:eastAsia="Arial" w:cs="Arial"/>
+      <w:b w:val="0"/>
+      <w:i w:val="0"/>
+      <w:color w:val="000000"/>
+      <w:sz w:val="24"/>
+    </w:rPr>
   </w:style>
   <w:style w:type="paragraph" w:customStyle="1" w:styleId="AbstractTitle">
     <w:name w:val="Abstract Title"/>
@@ -1469,6 +1567,16 @@
     <w:name w:val="Bibliography"/>
     <w:basedOn w:val="Normal"/>
     <w:qFormat/>
+    <w:pPr>
+      <w:spacing w:before="0" w:after="0" w:line="480" w:lineRule="auto"/>
+      <w:ind w:left="720" w:hanging="720"/>
+      <w:jc w:val="left"/>
+    </w:pPr>
+    <w:rPr>
+      <w:rFonts w:ascii="Arial" w:hAnsi="Arial" w:eastAsia="Arial" w:cs="Arial"/>
+      <w:color w:val="000000"/>
+      <w:sz w:val="24"/>
+    </w:rPr>
   </w:style>
   <w:style w:type="paragraph" w:styleId="Textodebloque">
     <w:name w:val="Block Text"/>
@@ -1478,9 +1586,15 @@
     <w:unhideWhenUsed/>
     <w:qFormat/>
     <w:pPr>
-      <w:spacing w:before="100" w:after="100"/>
-      <w:ind w:left="480" w:right="480"/>
-    </w:pPr>
+      <w:spacing w:before="120" w:after="120" w:line="480" w:lineRule="auto"/>
+      <w:ind w:left="720" w:right="480"/>
+      <w:jc w:val="both"/>
+    </w:pPr>
+    <w:rPr>
+      <w:rFonts w:ascii="Arial" w:hAnsi="Arial" w:eastAsia="Arial" w:cs="Arial"/>
+      <w:color w:val="000000"/>
+      <w:sz w:val="22"/>
+    </w:rPr>
   </w:style>
   <w:style w:type="paragraph" w:styleId="Textonotapie">
     <w:name w:val="footnote text"/>
@@ -1504,6 +1618,15 @@
     <w:semiHidden/>
     <w:unhideWhenUsed/>
     <w:qFormat/>
+    <w:pPr>
+      <w:spacing w:before="0" w:after="0" w:line="240" w:lineRule="auto"/>
+      <w:jc w:val="left"/>
+    </w:pPr>
+    <w:rPr>
+      <w:rFonts w:ascii="Arial" w:hAnsi="Arial" w:eastAsia="Arial" w:cs="Arial"/>
+      <w:color w:val="000000"/>
+      <w:sz w:val="20"/>
+    </w:rPr>
     <w:tblPr>
       <w:tblInd w:w="0" w:type="dxa"/>
       <w:tblCellMar>
@@ -1550,10 +1673,14 @@
     <w:basedOn w:val="Normal"/>
     <w:link w:val="DescripcinCar"/>
     <w:pPr>
-      <w:spacing w:after="120"/>
-    </w:pPr>
-    <w:rPr>
-      <w:i/>
+      <w:spacing w:after="120" w:before="120" w:line="276" w:lineRule="auto"/>
+      <w:jc w:val="left"/>
+    </w:pPr>
+    <w:rPr>
+      <w:rFonts w:ascii="Arial" w:hAnsi="Arial" w:eastAsia="Arial" w:cs="Arial"/>
+      <w:i w:val="0"/>
+      <w:color w:val="000000"/>
+      <w:sz w:val="22"/>
     </w:rPr>
   </w:style>
   <w:style w:type="paragraph" w:customStyle="1" w:styleId="TableCaption">
@@ -1607,7 +1734,9 @@
     <w:name w:val="Hyperlink"/>
     <w:basedOn w:val="DescripcinCar"/>
     <w:rPr>
-      <w:color w:val="4F81BD" w:themeColor="accent1"/>
+      <w:rFonts w:ascii="Arial" w:hAnsi="Arial" w:eastAsia="Arial" w:cs="Arial"/>
+      <w:color w:val="0563C1"/>
+      <w:sz w:val="24"/>
     </w:rPr>
   </w:style>
   <w:style w:type="paragraph" w:styleId="TtuloTDC">
@@ -1947,6 +2076,61 @@
       <w:color w:val="003B4F"/>
       <w:sz w:val="22"/>
       <w:shd w:val="clear" w:color="auto" w:fill="F1F3F5"/>
+    </w:rPr>
+  </w:style>
+  <w:style w:type="paragraph" w:customStyle="1" w:styleId="Quote">
+    <w:name w:val="Quote"/>
+    <w:basedOn w:val="Normal"/>
+    <w:pPr>
+      <w:spacing w:before="120" w:after="120" w:line="480" w:lineRule="auto"/>
+      <w:ind w:left="720"/>
+      <w:jc w:val="both"/>
+    </w:pPr>
+    <w:rPr>
+      <w:rFonts w:ascii="Arial" w:hAnsi="Arial" w:eastAsia="Arial" w:cs="Arial"/>
+      <w:color w:val="000000"/>
+      <w:sz w:val="22"/>
+    </w:rPr>
+  </w:style>
+  <w:style w:type="paragraph" w:customStyle="1" w:styleId="IntenseQuote">
+    <w:name w:val="Intense Quote"/>
+    <w:basedOn w:val="Normal"/>
+    <w:pPr>
+      <w:spacing w:before="120" w:after="120" w:line="480" w:lineRule="auto"/>
+      <w:ind w:left="720"/>
+      <w:jc w:val="both"/>
+    </w:pPr>
+    <w:rPr>
+      <w:rFonts w:ascii="Arial" w:hAnsi="Arial" w:eastAsia="Arial" w:cs="Arial"/>
+      <w:i/>
+      <w:color w:val="000000"/>
+      <w:sz w:val="22"/>
+    </w:rPr>
+  </w:style>
+  <w:style w:type="paragraph" w:customStyle="1" w:styleId="FootnoteText">
+    <w:name w:val="Footnote Text"/>
+    <w:basedOn w:val="Normal"/>
+    <w:pPr>
+      <w:spacing w:before="0" w:after="0" w:line="240" w:lineRule="auto"/>
+      <w:jc w:val="left"/>
+    </w:pPr>
+    <w:rPr>
+      <w:rFonts w:ascii="Arial" w:hAnsi="Arial" w:eastAsia="Arial" w:cs="Arial"/>
+      <w:color w:val="000000"/>
+      <w:sz w:val="20"/>
+    </w:rPr>
+  </w:style>
+  <w:style w:type="paragraph" w:customStyle="1" w:styleId="TableText">
+    <w:name w:val="Table Text"/>
+    <w:basedOn w:val="Normal"/>
+    <w:pPr>
+      <w:spacing w:before="0" w:after="0" w:line="240" w:lineRule="auto"/>
+      <w:jc w:val="left"/>
+    </w:pPr>
+    <w:rPr>
+      <w:rFonts w:ascii="Arial" w:hAnsi="Arial" w:eastAsia="Arial" w:cs="Arial"/>
+      <w:color w:val="000000"/>
+      <w:sz w:val="20"/>
     </w:rPr>
   </w:style>
 </w:styles>

</xml_diff>